<commit_message>
feat: update internship completion certificate details and file references
</commit_message>
<xml_diff>
--- a/offer_letter_app/output/temp/document.docx
+++ b/offer_letter_app/output/temp/document.docx
@@ -19,15 +19,15 @@
         <mc:AlternateContent>
           <mc:Choice Requires="wps">
             <w:drawing>
-              <wp:anchor distT="0" distB="0" distL="0" distR="0" simplePos="0" relativeHeight="15729152" behindDoc="0" locked="0" layoutInCell="1" allowOverlap="1" wp14:anchorId="77C20D0C" wp14:editId="6A7B8842">
+              <wp:anchor distT="0" distB="0" distL="0" distR="0" simplePos="0" relativeHeight="15729664" behindDoc="0" locked="0" layoutInCell="1" allowOverlap="1" wp14:anchorId="1202D105" wp14:editId="1119793F">
                 <wp:simplePos x="0" y="0"/>
                 <wp:positionH relativeFrom="page">
                   <wp:posOffset>0</wp:posOffset>
                 </wp:positionH>
                 <wp:positionV relativeFrom="page">
-                  <wp:posOffset>10140288</wp:posOffset>
+                  <wp:posOffset>10139689</wp:posOffset>
                 </wp:positionV>
-                <wp:extent cx="7562850" cy="556895"/>
+                <wp:extent cx="7560309" cy="552450"/>
                 <wp:effectExtent l="0" t="0" r="0" b="0"/>
                 <wp:wrapNone/>
                 <wp:docPr id="1" name="Graphic 1"/>
@@ -43,7 +43,7 @@
                       <wps:spPr>
                         <a:xfrm>
                           <a:off x="0" y="0"/>
-                          <a:ext cx="7562850" cy="556895"/>
+                          <a:ext cx="7560309" cy="552450"/>
                         </a:xfrm>
                         <a:custGeom>
                           <a:avLst/>
@@ -52,61 +52,37 @@
                           <a:cxnLst/>
                           <a:rect l="l" t="t" r="r" b="b"/>
                           <a:pathLst>
-                            <a:path w="7562850" h="556895">
+                            <a:path w="7560309" h="552450">
                               <a:moveTo>
-                                <a:pt x="7562850" y="469"/>
+                                <a:pt x="7559992" y="0"/>
                               </a:moveTo>
                               <a:lnTo>
-                                <a:pt x="6064783" y="469"/>
+                                <a:pt x="6035675" y="0"/>
                               </a:lnTo>
                               <a:lnTo>
-                                <a:pt x="6065139" y="215"/>
+                                <a:pt x="6015990" y="14605"/>
                               </a:lnTo>
                               <a:lnTo>
-                                <a:pt x="6064986" y="0"/>
+                                <a:pt x="5204460" y="261620"/>
                               </a:lnTo>
                               <a:lnTo>
-                                <a:pt x="6063437" y="469"/>
+                                <a:pt x="0" y="261620"/>
                               </a:lnTo>
                               <a:lnTo>
-                                <a:pt x="6035332" y="469"/>
+                                <a:pt x="0" y="551954"/>
                               </a:lnTo>
                               <a:lnTo>
-                                <a:pt x="6015939" y="14909"/>
+                                <a:pt x="7559992" y="551954"/>
                               </a:lnTo>
                               <a:lnTo>
-                                <a:pt x="5204384" y="261632"/>
-                              </a:lnTo>
-                              <a:lnTo>
-                                <a:pt x="0" y="261632"/>
-                              </a:lnTo>
-                              <a:lnTo>
-                                <a:pt x="0" y="556298"/>
-                              </a:lnTo>
-                              <a:lnTo>
-                                <a:pt x="4773942" y="556298"/>
-                              </a:lnTo>
-                              <a:lnTo>
-                                <a:pt x="5289143" y="556298"/>
-                              </a:lnTo>
-                              <a:lnTo>
-                                <a:pt x="5307533" y="556298"/>
-                              </a:lnTo>
-                              <a:lnTo>
-                                <a:pt x="7562850" y="556298"/>
-                              </a:lnTo>
-                              <a:lnTo>
-                                <a:pt x="7562850" y="261632"/>
-                              </a:lnTo>
-                              <a:lnTo>
-                                <a:pt x="7562850" y="469"/>
+                                <a:pt x="7559992" y="0"/>
                               </a:lnTo>
                               <a:close/>
                             </a:path>
                           </a:pathLst>
                         </a:custGeom>
                         <a:solidFill>
-                          <a:srgbClr val="DF7325"/>
+                          <a:srgbClr val="DE7224"/>
                         </a:solidFill>
                       </wps:spPr>
                       <wps:bodyPr wrap="square" lIns="0" tIns="0" rIns="0" bIns="0" rtlCol="0">
@@ -123,7 +99,7 @@
           </mc:Choice>
           <mc:Fallback>
             <w:pict>
-              <v:shape w14:anchorId="503FA8C6" id="Graphic 1" o:spid="_x0000_s1026" style="position:absolute;margin-left:0;margin-top:798.45pt;width:595.5pt;height:43.85pt;z-index:15729152;visibility:visible;mso-wrap-style:square;mso-wrap-distance-left:0;mso-wrap-distance-top:0;mso-wrap-distance-right:0;mso-wrap-distance-bottom:0;mso-position-horizontal:absolute;mso-position-horizontal-relative:page;mso-position-vertical:absolute;mso-position-vertical-relative:page;v-text-anchor:top" coordsize="7562850,556895" o:gfxdata="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" path="m7562850,469r-1498067,l6065139,215,6064986,r-1549,469l6035332,469r-19393,14440l5204384,261632,,261632,,556298r4773942,l5289143,556298r18390,l7562850,556298r,-294666l7562850,469xe" fillcolor="#df7325" stroked="f">
+              <v:shape w14:anchorId="447FDB0E" id="Graphic 1" o:spid="_x0000_s1026" style="position:absolute;margin-left:0;margin-top:798.4pt;width:595.3pt;height:43.5pt;z-index:15729664;visibility:visible;mso-wrap-style:square;mso-wrap-distance-left:0;mso-wrap-distance-top:0;mso-wrap-distance-right:0;mso-wrap-distance-bottom:0;mso-position-horizontal:absolute;mso-position-horizontal-relative:page;mso-position-vertical:absolute;mso-position-vertical-relative:page;v-text-anchor:top" coordsize="7560309,552450" o:gfxdata="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" path="m7559992,l6035675,r-19685,14605l5204460,261620,,261620,,551954r7559992,l7559992,xe" fillcolor="#de7224" stroked="f">
                 <v:path arrowok="t"/>
                 <w10:wrap anchorx="page" anchory="page"/>
               </v:shape>
@@ -140,15 +116,15 @@
         <mc:AlternateContent>
           <mc:Choice Requires="wps">
             <w:drawing>
-              <wp:anchor distT="0" distB="0" distL="0" distR="0" simplePos="0" relativeHeight="15729664" behindDoc="0" locked="0" layoutInCell="1" allowOverlap="1" wp14:anchorId="20273268" wp14:editId="1AC57EE0">
+              <wp:anchor distT="0" distB="0" distL="0" distR="0" simplePos="0" relativeHeight="15730176" behindDoc="0" locked="0" layoutInCell="1" allowOverlap="1" wp14:anchorId="194D23DB" wp14:editId="3F65445A">
                 <wp:simplePos x="0" y="0"/>
                 <wp:positionH relativeFrom="page">
-                  <wp:posOffset>2951308</wp:posOffset>
+                  <wp:posOffset>2950845</wp:posOffset>
                 </wp:positionH>
                 <wp:positionV relativeFrom="page">
-                  <wp:posOffset>700329</wp:posOffset>
+                  <wp:posOffset>700414</wp:posOffset>
                 </wp:positionV>
-                <wp:extent cx="4612005" cy="541020"/>
+                <wp:extent cx="4609465" cy="541020"/>
                 <wp:effectExtent l="0" t="0" r="0" b="0"/>
                 <wp:wrapNone/>
                 <wp:docPr id="2" name="Graphic 2"/>
@@ -164,7 +140,7 @@
                       <wps:spPr>
                         <a:xfrm>
                           <a:off x="0" y="0"/>
-                          <a:ext cx="4612005" cy="541020"/>
+                          <a:ext cx="4609465" cy="541020"/>
                         </a:xfrm>
                         <a:custGeom>
                           <a:avLst/>
@@ -173,28 +149,28 @@
                           <a:cxnLst/>
                           <a:rect l="l" t="t" r="r" b="b"/>
                           <a:pathLst>
-                            <a:path w="4612005" h="541020">
+                            <a:path w="4609465" h="541020">
                               <a:moveTo>
-                                <a:pt x="4611541" y="541015"/>
+                                <a:pt x="4609147" y="0"/>
                               </a:moveTo>
-                              <a:lnTo>
-                                <a:pt x="0" y="541015"/>
-                              </a:lnTo>
                               <a:lnTo>
                                 <a:pt x="0" y="0"/>
                               </a:lnTo>
                               <a:lnTo>
-                                <a:pt x="4611541" y="0"/>
+                                <a:pt x="0" y="541020"/>
                               </a:lnTo>
                               <a:lnTo>
-                                <a:pt x="4611541" y="541015"/>
+                                <a:pt x="4609147" y="541020"/>
+                              </a:lnTo>
+                              <a:lnTo>
+                                <a:pt x="4609147" y="0"/>
                               </a:lnTo>
                               <a:close/>
                             </a:path>
                           </a:pathLst>
                         </a:custGeom>
                         <a:solidFill>
-                          <a:srgbClr val="DF7325"/>
+                          <a:srgbClr val="DE7224"/>
                         </a:solidFill>
                       </wps:spPr>
                       <wps:bodyPr wrap="square" lIns="0" tIns="0" rIns="0" bIns="0" rtlCol="0">
@@ -211,7 +187,7 @@
           </mc:Choice>
           <mc:Fallback>
             <w:pict>
-              <v:shape w14:anchorId="554E18EC" id="Graphic 2" o:spid="_x0000_s1026" style="position:absolute;margin-left:232.4pt;margin-top:55.15pt;width:363.15pt;height:42.6pt;z-index:15729664;visibility:visible;mso-wrap-style:square;mso-wrap-distance-left:0;mso-wrap-distance-top:0;mso-wrap-distance-right:0;mso-wrap-distance-bottom:0;mso-position-horizontal:absolute;mso-position-horizontal-relative:page;mso-position-vertical:absolute;mso-position-vertical-relative:page;v-text-anchor:top" coordsize="4612005,541020" o:gfxdata="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" path="m4611541,541015l,541015,,,4611541,r,541015xe" fillcolor="#df7325" stroked="f">
+              <v:shape w14:anchorId="6E8F3217" id="Graphic 2" o:spid="_x0000_s1026" style="position:absolute;margin-left:232.35pt;margin-top:55.15pt;width:362.95pt;height:42.6pt;z-index:15730176;visibility:visible;mso-wrap-style:square;mso-wrap-distance-left:0;mso-wrap-distance-top:0;mso-wrap-distance-right:0;mso-wrap-distance-bottom:0;mso-position-horizontal:absolute;mso-position-horizontal-relative:page;mso-position-vertical:absolute;mso-position-vertical-relative:page;v-text-anchor:top" coordsize="4609465,541020" o:gfxdata="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" path="m4609147,l,,,541020r4609147,l4609147,xe" fillcolor="#de7224" stroked="f">
                 <v:path arrowok="t"/>
                 <w10:wrap anchorx="page" anchory="page"/>
               </v:shape>
@@ -223,13 +199,12 @@
         <w:rPr>
           <w:rFonts w:ascii="Times New Roman"/>
           <w:noProof/>
-          <w:position w:val="8"/>
           <w:sz w:val="20"/>
         </w:rPr>
         <mc:AlternateContent>
           <mc:Choice Requires="wpg">
             <w:drawing>
-              <wp:inline distT="0" distB="0" distL="0" distR="0" wp14:anchorId="25A1089B" wp14:editId="2DD3E2C0">
+              <wp:inline distT="0" distB="0" distL="0" distR="0" wp14:anchorId="2AFC0896" wp14:editId="21E23ECE">
                 <wp:extent cx="664210" cy="541020"/>
                 <wp:effectExtent l="0" t="0" r="0" b="0"/>
                 <wp:docPr id="3" name="Group 3"/>
@@ -267,26 +242,26 @@
                             <a:pathLst>
                               <a:path w="664210" h="541020">
                                 <a:moveTo>
-                                  <a:pt x="663723" y="541015"/>
+                                  <a:pt x="664210" y="541020"/>
                                 </a:moveTo>
                                 <a:lnTo>
-                                  <a:pt x="0" y="541015"/>
+                                  <a:pt x="0" y="541020"/>
                                 </a:lnTo>
                                 <a:lnTo>
                                   <a:pt x="0" y="0"/>
                                 </a:lnTo>
                                 <a:lnTo>
-                                  <a:pt x="663723" y="0"/>
+                                  <a:pt x="664210" y="0"/>
                                 </a:lnTo>
                                 <a:lnTo>
-                                  <a:pt x="663723" y="541015"/>
+                                  <a:pt x="664210" y="541020"/>
                                 </a:lnTo>
                                 <a:close/>
                               </a:path>
                             </a:pathLst>
                           </a:custGeom>
                           <a:solidFill>
-                            <a:srgbClr val="150E2A"/>
+                            <a:srgbClr val="140D29"/>
                           </a:solidFill>
                         </wps:spPr>
                         <wps:bodyPr wrap="square" lIns="0" tIns="0" rIns="0" bIns="0" rtlCol="0">
@@ -304,8 +279,8 @@
           </mc:Choice>
           <mc:Fallback>
             <w:pict>
-              <v:group w14:anchorId="55417FD3" id="Group 3" o:spid="_x0000_s1026" style="width:52.3pt;height:42.6pt;mso-position-horizontal-relative:char;mso-position-vertical-relative:line" coordsize="6642,5410" o:gfxdata="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">
-                <v:shape id="Graphic 4" o:spid="_x0000_s1027" style="position:absolute;width:6642;height:5410;visibility:visible;mso-wrap-style:square;v-text-anchor:top" coordsize="664210,541020" o:gfxdata="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" path="m663723,541015l,541015,,,663723,r,541015xe" fillcolor="#150e2a" stroked="f">
+              <v:group w14:anchorId="23547CDB" id="Group 3" o:spid="_x0000_s1026" style="width:52.3pt;height:42.6pt;mso-position-horizontal-relative:char;mso-position-vertical-relative:line" coordsize="6642,5410" o:gfxdata="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">
+                <v:shape id="Graphic 4" o:spid="_x0000_s1027" style="position:absolute;width:6642;height:5410;visibility:visible;mso-wrap-style:square;v-text-anchor:top" coordsize="664210,541020" o:gfxdata="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" path="m664210,541020l,541020,,,664210,r,541020xe" fillcolor="#140d29" stroked="f">
                   <v:path arrowok="t"/>
                 </v:shape>
                 <w10:anchorlock/>
@@ -317,8 +292,7 @@
       <w:r>
         <w:rPr>
           <w:rFonts w:ascii="Times New Roman"/>
-          <w:spacing w:val="42"/>
-          <w:position w:val="8"/>
+          <w:spacing w:val="30"/>
           <w:sz w:val="20"/>
         </w:rPr>
         <w:t xml:space="preserve"> </w:t>
@@ -327,12 +301,12 @@
         <w:rPr>
           <w:rFonts w:ascii="Times New Roman"/>
           <w:noProof/>
-          <w:spacing w:val="42"/>
+          <w:spacing w:val="30"/>
           <w:sz w:val="20"/>
         </w:rPr>
         <w:drawing>
-          <wp:inline distT="0" distB="0" distL="0" distR="0" wp14:anchorId="34AE9B52" wp14:editId="29895BC7">
-            <wp:extent cx="2153916" cy="648080"/>
+          <wp:inline distT="0" distB="0" distL="0" distR="0" wp14:anchorId="7F903648" wp14:editId="5A7F5301">
+            <wp:extent cx="2156030" cy="648080"/>
             <wp:effectExtent l="0" t="0" r="0" b="0"/>
             <wp:docPr id="5" name="Image 5"/>
             <wp:cNvGraphicFramePr>
@@ -354,7 +328,7 @@
                   <pic:spPr>
                     <a:xfrm>
                       <a:off x="0" y="0"/>
-                      <a:ext cx="2153916" cy="648080"/>
+                      <a:ext cx="2156030" cy="648080"/>
                     </a:xfrm>
                     <a:prstGeom prst="rect">
                       <a:avLst/>
@@ -418,7 +392,7 @@
     <w:p>
       <w:pPr>
         <w:pStyle w:val="BodyText"/>
-        <w:spacing w:before="84"/>
+        <w:spacing w:before="107"/>
         <w:rPr>
           <w:rFonts w:ascii="Times New Roman"/>
         </w:rPr>
@@ -426,242 +400,301 @@
     </w:p>
     <w:p>
       <w:pPr>
-        <w:pStyle w:val="Heading1"/>
-        <w:rPr>
-          <w:b w:val="0"/>
-        </w:rPr>
-      </w:pPr>
-      <w:bookmarkStart w:id="0" w:name="Issued_on:_15/06/2026"/>
-      <w:bookmarkStart w:id="1" w:name="internship_completion_certificate"/>
-      <w:bookmarkStart w:id="2" w:name="This_is_to_certify_that_Chaitya_shah__su"/>
-      <w:bookmarkStart w:id="3" w:name="Certified_by:"/>
-      <w:bookmarkStart w:id="4" w:name="Vibrant_Technology_Team_Leader"/>
+        <w:pStyle w:val="BodyText"/>
+        <w:tabs>
+          <w:tab w:val="left" w:pos="6299"/>
+        </w:tabs>
+        <w:ind w:left="12"/>
+      </w:pPr>
+      <w:bookmarkStart w:id="0" w:name="Issued_on:_19/06/2026_Enroll_on:_2402106"/>
       <w:bookmarkEnd w:id="0"/>
-      <w:bookmarkEnd w:id="1"/>
-      <w:bookmarkEnd w:id="2"/>
-      <w:bookmarkEnd w:id="3"/>
-      <w:bookmarkEnd w:id="4"/>
-      <w:r>
-        <w:rPr>
-          <w:b w:val="0"/>
+      <w:r>
+        <w:rPr>
+          <w:b/>
+          <w:bCs/>
           <w:w w:val="90"/>
         </w:rPr>
-        <w:t>Issued on: 15/06/2026                                                                        Enroll on: 230020116060</w:t>
-      </w:r>
-      <w:r>
-        <w:rPr>
-          <w:b w:val="0"/>
+        <w:t>Issued</w:t>
+      </w:r>
+      <w:r>
+        <w:rPr>
+          <w:b/>
+          <w:bCs/>
+        </w:rPr>
+        <w:t xml:space="preserve"> </w:t>
+      </w:r>
+      <w:r>
+        <w:rPr>
+          <w:b/>
+          <w:bCs/>
+          <w:w w:val="90"/>
+        </w:rPr>
+        <w:t>on</w:t>
+      </w:r>
+      <w:r>
+        <w:rPr>
+          <w:w w:val="90"/>
+        </w:rPr>
+        <w:t>:</w:t>
+      </w:r>
+      <w:r>
+        <w:rPr>
+          <w:spacing w:val="1"/>
+        </w:rPr>
+        <w:t xml:space="preserve"> </w:t>
+      </w:r>
+      <w:r>
+        <w:rPr>
           <w:spacing w:val="-2"/>
           <w:w w:val="90"/>
         </w:rPr>
-      </w:r>
-      <w:r>
-        <w:rPr>
-          <w:b w:val="0"/>
-          <w:w w:val="90"/>
-        </w:rPr>
-      </w:r>
-      <w:r>
-        <w:rPr>
-          <w:b w:val="0"/>
-          <w:spacing w:val="-1"/>
-          <w:w w:val="90"/>
-        </w:rPr>
-      </w:r>
-      <w:r>
-        <w:rPr>
-          <w:b w:val="0"/>
+        <w:t>19/06/2026</w:t>
+      </w:r>
+      <w:r>
+        <w:tab/>
+      </w:r>
+      <w:r>
+        <w:t xml:space="preserve">                     </w:t>
+      </w:r>
+      <w:r>
+        <w:rPr>
+          <w:b/>
+          <w:bCs/>
+          <w:w w:val="95"/>
+        </w:rPr>
+        <w:t>E</w:t>
+      </w:r>
+      <w:r>
+        <w:rPr>
+          <w:b/>
+          <w:bCs/>
+          <w:w w:val="95"/>
+        </w:rPr>
+        <w:t>nrollment</w:t>
+      </w:r>
+      <w:r>
+        <w:rPr>
+          <w:b/>
+          <w:bCs/>
+          <w:spacing w:val="-14"/>
+          <w:w w:val="95"/>
+        </w:rPr>
+        <w:t xml:space="preserve"> </w:t>
+      </w:r>
+      <w:r>
+        <w:rPr>
+          <w:b/>
+          <w:bCs/>
+          <w:w w:val="95"/>
+        </w:rPr>
+        <w:t>on:</w:t>
+      </w:r>
+      <w:r>
+        <w:rPr>
+          <w:spacing w:val="-14"/>
+          <w:w w:val="95"/>
+        </w:rPr>
+        <w:t xml:space="preserve"> </w:t>
+      </w:r>
+      <w:r>
+        <w:rPr>
           <w:spacing w:val="-2"/>
-          <w:w w:val="90"/>
-        </w:rPr>
-      </w:r>
-      <w:r>
-        <w:rPr>
-          <w:b w:val="0"/>
+          <w:w w:val="95"/>
+        </w:rPr>
+        <w:t>2402106051</w:t>
+      </w:r>
+    </w:p>
+    <w:p>
+      <w:pPr>
+        <w:pStyle w:val="BodyText"/>
+      </w:pPr>
+    </w:p>
+    <w:p>
+      <w:pPr>
+        <w:pStyle w:val="BodyText"/>
+      </w:pPr>
+    </w:p>
+    <w:p>
+      <w:pPr>
+        <w:pStyle w:val="BodyText"/>
+        <w:spacing w:before="214"/>
+      </w:pPr>
+    </w:p>
+    <w:p>
+      <w:pPr>
+        <w:pStyle w:val="BodyText"/>
+        <w:ind w:right="105"/>
+        <w:jc w:val="center"/>
+        <w:rPr>
+          <w:b/>
+          <w:bCs/>
+        </w:rPr>
+      </w:pPr>
+      <w:r>
+        <w:rPr>
+          <w:b/>
+          <w:bCs/>
+          <w:u w:val="single"/>
+        </w:rPr>
+        <w:t>I</w:t>
+      </w:r>
+      <w:r>
+        <w:rPr>
+          <w:b/>
+          <w:bCs/>
+          <w:u w:val="single"/>
+        </w:rPr>
+        <w:t>nternship</w:t>
+      </w:r>
+      <w:r>
+        <w:rPr>
+          <w:b/>
+          <w:bCs/>
+          <w:spacing w:val="5"/>
+        </w:rPr>
+        <w:t xml:space="preserve"> </w:t>
+      </w:r>
+      <w:r>
+        <w:rPr>
+          <w:b/>
+          <w:bCs/>
+          <w:u w:val="single"/>
+        </w:rPr>
+        <w:t>C</w:t>
+      </w:r>
+      <w:r>
+        <w:rPr>
+          <w:b/>
+          <w:bCs/>
+          <w:u w:val="single"/>
+        </w:rPr>
+        <w:t>ompletion</w:t>
+      </w:r>
+      <w:r>
+        <w:rPr>
+          <w:b/>
+          <w:bCs/>
+          <w:spacing w:val="5"/>
+          <w:u w:val="single"/>
+        </w:rPr>
+        <w:t xml:space="preserve"> </w:t>
+      </w:r>
+      <w:r>
+        <w:rPr>
+          <w:b/>
+          <w:bCs/>
           <w:spacing w:val="-2"/>
-          <w:w w:val="90"/>
-        </w:rPr>
-      </w:r>
-      <w:r>
-        <w:rPr>
-          <w:b w:val="0"/>
-          <w:w w:val="90"/>
-        </w:rPr>
-      </w:r>
-      <w:r>
-        <w:rPr>
-          <w:b w:val="0"/>
+          <w:u w:val="single"/>
+        </w:rPr>
+        <w:t>C</w:t>
+      </w:r>
+      <w:r>
+        <w:rPr>
+          <w:b/>
+          <w:bCs/>
           <w:spacing w:val="-2"/>
-          <w:w w:val="90"/>
-        </w:rPr>
-      </w:r>
-      <w:r>
-        <w:rPr>
-          <w:b w:val="0"/>
-          <w:w w:val="90"/>
-        </w:rPr>
-      </w:r>
-      <w:r/>
-      <w:r>
-        <w:rPr>
-          <w:b w:val="0"/>
-          <w:w w:val="90"/>
-        </w:rPr>
-      </w:r>
-    </w:p>
-    <w:p>
-      <w:pPr>
-        <w:pStyle w:val="Heading1"/>
-        <w:rPr>
-          <w:b w:val="0"/>
-        </w:rPr>
-      </w:pPr>
-    </w:p>
-    <w:p>
-      <w:pPr>
-        <w:pStyle w:val="BodyText"/>
-        <w:rPr>
-          <w:rFonts w:ascii="Arial Black"/>
-        </w:rPr>
-      </w:pPr>
-    </w:p>
-    <w:p>
-      <w:pPr>
-        <w:pStyle w:val="BodyText"/>
-        <w:spacing w:before="65"/>
-        <w:rPr>
-          <w:rFonts w:ascii="Arial Black"/>
-        </w:rPr>
-      </w:pPr>
-    </w:p>
-    <w:p>
-      <w:pPr>
-        <w:ind w:right="109"/>
-        <w:jc w:val="center"/>
-        <w:rPr>
-          <w:rFonts w:ascii="Arial Black"/>
-          <w:sz w:val="24"/>
-        </w:rPr>
-      </w:pPr>
-      <w:r>
-        <w:rPr>
-          <w:rFonts w:ascii="Arial Black"/>
-          <w:spacing w:val="2"/>
-          <w:w w:val="90"/>
-          <w:sz w:val="24"/>
           <w:u w:val="single"/>
         </w:rPr>
-        <w:t>internship</w:t>
-      </w:r>
-      <w:r>
-        <w:rPr>
-          <w:rFonts w:ascii="Arial Black"/>
-          <w:spacing w:val="16"/>
-          <w:sz w:val="24"/>
+        <w:t>ertificate</w:t>
+      </w:r>
+    </w:p>
+    <w:p>
+      <w:pPr>
+        <w:pStyle w:val="BodyText"/>
+        <w:spacing w:before="104"/>
+      </w:pPr>
+    </w:p>
+    <w:p>
+      <w:pPr>
+        <w:pStyle w:val="BodyText"/>
+        <w:spacing w:line="235" w:lineRule="auto"/>
+        <w:ind w:left="12" w:right="123" w:firstLine="559"/>
+        <w:jc w:val="both"/>
+      </w:pPr>
+      <w:r>
+        <w:t xml:space="preserve">This is to certify that </w:t>
+      </w:r>
+      <w:r>
+        <w:rPr>
+          <w:b/>
+        </w:rPr>
+        <w:t>Chaitya shah</w:t>
+      </w:r>
+      <w:r>
+        <w:t xml:space="preserve"> successfully completed internship with grade A for </w:t>
+      </w:r>
+      <w:r>
+        <w:rPr>
+          <w:b/>
+        </w:rPr>
+        <w:t>Python With Data Analytics</w:t>
+      </w:r>
+      <w:r>
+        <w:t xml:space="preserve"> conducted by Vibrant Technology from 20/05/2026 to 19/06/2026 at 801, Silicon Tower, Law Garden, opp. Axis Bank, Ellisbridge, Ahmedabad,.</w:t>
+      </w:r>
+    </w:p>
+    <w:p>
+      <w:pPr>
+        <w:pStyle w:val="BodyText"/>
+      </w:pPr>
+    </w:p>
+    <w:p>
+      <w:pPr>
+        <w:pStyle w:val="BodyText"/>
+      </w:pPr>
+    </w:p>
+    <w:p>
+      <w:pPr>
+        <w:pStyle w:val="BodyText"/>
+        <w:spacing w:before="151"/>
+      </w:pPr>
+    </w:p>
+    <w:p>
+      <w:pPr>
+        <w:pStyle w:val="BodyText"/>
+        <w:spacing w:before="1"/>
+        <w:ind w:left="12"/>
+      </w:pPr>
+      <w:bookmarkStart w:id="1" w:name="Certified_by:"/>
+      <w:bookmarkEnd w:id="1"/>
+      <w:r>
+        <w:rPr>
+          <w:spacing w:val="-4"/>
+        </w:rPr>
+        <w:t>Certified</w:t>
+      </w:r>
+      <w:r>
+        <w:rPr>
+          <w:spacing w:val="-2"/>
         </w:rPr>
         <w:t xml:space="preserve"> </w:t>
       </w:r>
       <w:r>
         <w:rPr>
-          <w:rFonts w:ascii="Arial Black"/>
-          <w:spacing w:val="2"/>
-          <w:w w:val="90"/>
-          <w:sz w:val="24"/>
-          <w:u w:val="single"/>
-        </w:rPr>
-        <w:t>completion</w:t>
-      </w:r>
-      <w:r>
-        <w:rPr>
-          <w:rFonts w:ascii="Arial Black"/>
-          <w:spacing w:val="17"/>
-          <w:sz w:val="24"/>
-          <w:u w:val="single"/>
-        </w:rPr>
-        <w:t xml:space="preserve"> </w:t>
-      </w:r>
-      <w:r>
-        <w:rPr>
-          <w:rFonts w:ascii="Arial Black"/>
-          <w:spacing w:val="-2"/>
-          <w:w w:val="90"/>
-          <w:sz w:val="24"/>
-          <w:u w:val="single"/>
-        </w:rPr>
-        <w:t>certificate</w:t>
-      </w:r>
-    </w:p>
-    <w:p>
-      <w:pPr>
-        <w:pStyle w:val="BodyText"/>
-        <w:spacing w:before="49"/>
-        <w:rPr>
-          <w:rFonts w:ascii="Arial Black"/>
-        </w:rPr>
-      </w:pPr>
-    </w:p>
-    <w:p>
-      <w:pPr>
-        <w:pStyle w:val="BodyText"/>
-        <w:spacing w:line="235" w:lineRule="auto"/>
-        <w:ind w:left="11" w:firstLine="559"/>
-      </w:pPr>
-      <w:r>
-        <w:t xml:space="preserve">This is to certify that </w:t>
-      </w:r>
-      <w:r>
-        <w:rPr>
-          <w:b/>
-        </w:rPr>
-        <w:t>Chaitya shah</w:t>
-      </w:r>
-      <w:r>
-        <w:t xml:space="preserve"> successfully completed internship with grade A for </w:t>
-      </w:r>
-      <w:r>
-        <w:rPr>
-          <w:b/>
-        </w:rPr>
-        <w:t>Python With Data Analytics</w:t>
-      </w:r>
-      <w:r>
-        <w:t xml:space="preserve"> conducted by Vibrant Technology from 16/05/2026 to 15/06/2026 at 801, Silicon Tower, Law Garden, opp. Axis Bank, Ellisbridge, Ahmedabad,.</w:t>
-      </w:r>
-    </w:p>
-    <w:p>
-      <w:pPr>
-        <w:pStyle w:val="BodyText"/>
-      </w:pPr>
-    </w:p>
-    <w:p>
-      <w:pPr>
-        <w:pStyle w:val="BodyText"/>
-        <w:spacing w:before="332"/>
-      </w:pPr>
-    </w:p>
-    <w:p>
-      <w:pPr>
-        <w:pStyle w:val="Heading1"/>
-        <w:rPr>
-          <w:b w:val="0"/>
-        </w:rPr>
-      </w:pPr>
-      <w:r>
-        <w:rPr>
-          <w:b w:val="0"/>
+          <w:spacing w:val="-5"/>
+        </w:rPr>
+        <w:t>by:</w:t>
+      </w:r>
+    </w:p>
+    <w:p>
+      <w:pPr>
+        <w:pStyle w:val="BodyText"/>
+      </w:pPr>
+      <w:r>
+        <w:rPr>
           <w:noProof/>
         </w:rPr>
         <w:drawing>
-          <wp:anchor distT="0" distB="0" distL="0" distR="0" simplePos="0" relativeHeight="487549952" behindDoc="1" locked="0" layoutInCell="1" allowOverlap="1" wp14:anchorId="1592A39C" wp14:editId="359B41A2">
+          <wp:anchor distT="0" distB="0" distL="0" distR="0" simplePos="0" relativeHeight="251658240" behindDoc="1" locked="0" layoutInCell="1" allowOverlap="1" wp14:anchorId="61A0281A" wp14:editId="2D871983">
             <wp:simplePos x="0" y="0"/>
             <wp:positionH relativeFrom="page">
-              <wp:posOffset>484801</wp:posOffset>
+              <wp:posOffset>342900</wp:posOffset>
             </wp:positionH>
             <wp:positionV relativeFrom="paragraph">
-              <wp:posOffset>125656</wp:posOffset>
+              <wp:posOffset>7620</wp:posOffset>
             </wp:positionV>
-            <wp:extent cx="1772317" cy="1400702"/>
-            <wp:effectExtent l="0" t="0" r="0" b="0"/>
+            <wp:extent cx="1390650" cy="1142365"/>
+            <wp:effectExtent l="0" t="0" r="0" b="635"/>
             <wp:wrapNone/>
             <wp:docPr id="6" name="Image 6"/>
             <wp:cNvGraphicFramePr>
@@ -683,7 +716,7 @@
                   <pic:spPr>
                     <a:xfrm>
                       <a:off x="0" y="0"/>
-                      <a:ext cx="1772317" cy="1400702"/>
+                      <a:ext cx="1390650" cy="1142365"/>
                     </a:xfrm>
                     <a:prstGeom prst="rect">
                       <a:avLst/>
@@ -692,221 +725,126 @@
                 </pic:pic>
               </a:graphicData>
             </a:graphic>
+            <wp14:sizeRelH relativeFrom="margin">
+              <wp14:pctWidth>0</wp14:pctWidth>
+            </wp14:sizeRelH>
+            <wp14:sizeRelV relativeFrom="margin">
+              <wp14:pctHeight>0</wp14:pctHeight>
+            </wp14:sizeRelV>
           </wp:anchor>
         </w:drawing>
       </w:r>
-      <w:r>
-        <w:rPr>
-          <w:b w:val="0"/>
-          <w:w w:val="90"/>
-        </w:rPr>
-        <w:t>Certified</w:t>
-      </w:r>
-      <w:r>
-        <w:rPr>
-          <w:b w:val="0"/>
-        </w:rPr>
-        <w:t xml:space="preserve"> </w:t>
-      </w:r>
-      <w:r>
-        <w:rPr>
-          <w:b w:val="0"/>
-          <w:spacing w:val="-5"/>
-        </w:rPr>
-        <w:t>by:</w:t>
-      </w:r>
-    </w:p>
-    <w:p>
-      <w:pPr>
-        <w:pStyle w:val="BodyText"/>
-        <w:rPr>
-          <w:rFonts w:ascii="Arial Black"/>
-        </w:rPr>
-      </w:pPr>
-    </w:p>
-    <w:p>
-      <w:pPr>
-        <w:pStyle w:val="BodyText"/>
-        <w:rPr>
-          <w:rFonts w:ascii="Arial Black"/>
-        </w:rPr>
-      </w:pPr>
-    </w:p>
-    <w:p>
-      <w:pPr>
-        <w:pStyle w:val="BodyText"/>
-        <w:rPr>
-          <w:rFonts w:ascii="Arial Black"/>
-        </w:rPr>
-      </w:pPr>
-    </w:p>
-    <w:p>
-      <w:pPr>
-        <w:pStyle w:val="BodyText"/>
-        <w:rPr>
-          <w:rFonts w:ascii="Arial Black"/>
-        </w:rPr>
-      </w:pPr>
-    </w:p>
-    <w:p>
-      <w:pPr>
-        <w:pStyle w:val="BodyText"/>
-        <w:spacing w:before="130"/>
-        <w:rPr>
-          <w:rFonts w:ascii="Arial Black"/>
-        </w:rPr>
-      </w:pPr>
-    </w:p>
-    <w:p>
-      <w:pPr>
-        <w:spacing w:line="254" w:lineRule="auto"/>
-        <w:ind w:left="11" w:right="7938"/>
-        <w:rPr>
-          <w:rFonts w:ascii="Arial Black"/>
-          <w:sz w:val="24"/>
-        </w:rPr>
-      </w:pPr>
-      <w:r>
-        <w:rPr>
-          <w:rFonts w:ascii="Arial Black"/>
-          <w:spacing w:val="-8"/>
-          <w:sz w:val="24"/>
-        </w:rPr>
-        <w:t>Vibrant</w:t>
-      </w:r>
-      <w:r>
-        <w:rPr>
-          <w:rFonts w:ascii="Arial Black"/>
-          <w:spacing w:val="-27"/>
-          <w:sz w:val="24"/>
-        </w:rPr>
-        <w:t xml:space="preserve"> </w:t>
-      </w:r>
-      <w:r>
-        <w:rPr>
-          <w:rFonts w:ascii="Arial Black"/>
-          <w:spacing w:val="-8"/>
-          <w:sz w:val="24"/>
-        </w:rPr>
-        <w:t xml:space="preserve">Technology </w:t>
-      </w:r>
-      <w:r>
-        <w:rPr>
-          <w:rFonts w:ascii="Arial Black"/>
-          <w:sz w:val="24"/>
-        </w:rPr>
-        <w:t>Team</w:t>
-      </w:r>
-      <w:r>
-        <w:rPr>
-          <w:rFonts w:ascii="Arial Black"/>
-          <w:spacing w:val="-21"/>
-          <w:sz w:val="24"/>
-        </w:rPr>
-        <w:t xml:space="preserve"> </w:t>
-      </w:r>
-      <w:r>
-        <w:rPr>
-          <w:rFonts w:ascii="Arial Black"/>
-          <w:sz w:val="24"/>
-        </w:rPr>
-        <w:t>Leader</w:t>
-      </w:r>
-    </w:p>
-    <w:p>
-      <w:pPr>
-        <w:pStyle w:val="BodyText"/>
-        <w:rPr>
-          <w:rFonts w:ascii="Arial Black"/>
-          <w:sz w:val="18"/>
-        </w:rPr>
-      </w:pPr>
-    </w:p>
-    <w:p>
-      <w:pPr>
-        <w:pStyle w:val="BodyText"/>
-        <w:rPr>
-          <w:rFonts w:ascii="Arial Black"/>
-          <w:sz w:val="18"/>
-        </w:rPr>
-      </w:pPr>
-    </w:p>
-    <w:p>
-      <w:pPr>
-        <w:pStyle w:val="BodyText"/>
-        <w:rPr>
-          <w:rFonts w:ascii="Arial Black"/>
-          <w:sz w:val="18"/>
-        </w:rPr>
-      </w:pPr>
-    </w:p>
-    <w:p>
-      <w:pPr>
-        <w:pStyle w:val="BodyText"/>
-        <w:rPr>
-          <w:rFonts w:ascii="Arial Black"/>
-          <w:sz w:val="18"/>
-        </w:rPr>
-      </w:pPr>
-    </w:p>
-    <w:p>
-      <w:pPr>
-        <w:pStyle w:val="BodyText"/>
-        <w:rPr>
-          <w:rFonts w:ascii="Arial Black"/>
-          <w:sz w:val="18"/>
-        </w:rPr>
-      </w:pPr>
-    </w:p>
-    <w:p>
-      <w:pPr>
-        <w:pStyle w:val="BodyText"/>
-        <w:rPr>
-          <w:rFonts w:ascii="Arial Black"/>
-          <w:sz w:val="18"/>
-        </w:rPr>
-      </w:pPr>
-    </w:p>
-    <w:p>
-      <w:pPr>
-        <w:pStyle w:val="BodyText"/>
-        <w:rPr>
-          <w:rFonts w:ascii="Arial Black"/>
-          <w:sz w:val="18"/>
-        </w:rPr>
-      </w:pPr>
-    </w:p>
-    <w:p>
-      <w:pPr>
-        <w:pStyle w:val="BodyText"/>
-        <w:rPr>
-          <w:rFonts w:ascii="Arial Black"/>
-          <w:sz w:val="18"/>
-        </w:rPr>
-      </w:pPr>
-    </w:p>
-    <w:p>
-      <w:pPr>
-        <w:pStyle w:val="BodyText"/>
-        <w:rPr>
-          <w:rFonts w:ascii="Arial Black"/>
-          <w:sz w:val="18"/>
-        </w:rPr>
-      </w:pPr>
-    </w:p>
-    <w:p>
-      <w:pPr>
-        <w:pStyle w:val="BodyText"/>
-        <w:spacing w:before="137"/>
-        <w:rPr>
-          <w:rFonts w:ascii="Arial Black"/>
-          <w:sz w:val="18"/>
-        </w:rPr>
-      </w:pPr>
-    </w:p>
-    <w:p>
-      <w:pPr>
-        <w:ind w:left="7454"/>
+    </w:p>
+    <w:p>
+      <w:pPr>
+        <w:pStyle w:val="BodyText"/>
+      </w:pPr>
+    </w:p>
+    <w:p>
+      <w:pPr>
+        <w:pStyle w:val="BodyText"/>
+      </w:pPr>
+    </w:p>
+    <w:p>
+      <w:pPr>
+        <w:pStyle w:val="BodyText"/>
+      </w:pPr>
+    </w:p>
+    <w:p>
+      <w:pPr>
+        <w:pStyle w:val="BodyText"/>
+      </w:pPr>
+    </w:p>
+    <w:p>
+      <w:pPr>
+        <w:pStyle w:val="BodyText"/>
+        <w:spacing w:before="64"/>
+      </w:pPr>
+    </w:p>
+    <w:p>
+      <w:pPr>
+        <w:pStyle w:val="BodyText"/>
+        <w:spacing w:line="285" w:lineRule="auto"/>
+        <w:ind w:left="12" w:right="7603"/>
+      </w:pPr>
+      <w:r>
+        <w:rPr>
+          <w:spacing w:val="-4"/>
+          <w:w w:val="105"/>
+        </w:rPr>
+        <w:t xml:space="preserve">  </w:t>
+      </w:r>
+      <w:proofErr w:type="spellStart"/>
+      <w:proofErr w:type="gramStart"/>
+      <w:r>
+        <w:rPr>
+          <w:spacing w:val="-4"/>
+          <w:w w:val="105"/>
+        </w:rPr>
+        <w:t>Mr.Dipen</w:t>
+      </w:r>
+      <w:proofErr w:type="spellEnd"/>
+      <w:proofErr w:type="gramEnd"/>
+      <w:r>
+        <w:rPr>
+          <w:spacing w:val="-4"/>
+          <w:w w:val="105"/>
+        </w:rPr>
+        <w:t xml:space="preserve"> Patel</w:t>
+      </w:r>
+      <w:r>
+        <w:rPr>
+          <w:spacing w:val="-4"/>
+          <w:w w:val="105"/>
+        </w:rPr>
+        <w:br/>
+        <w:t xml:space="preserve">   CO - Founder</w:t>
+      </w:r>
+    </w:p>
+    <w:p>
+      <w:pPr>
+        <w:pStyle w:val="BodyText"/>
+      </w:pPr>
+    </w:p>
+    <w:p>
+      <w:pPr>
+        <w:pStyle w:val="BodyText"/>
+      </w:pPr>
+    </w:p>
+    <w:p>
+      <w:pPr>
+        <w:pStyle w:val="BodyText"/>
+      </w:pPr>
+    </w:p>
+    <w:p>
+      <w:pPr>
+        <w:pStyle w:val="BodyText"/>
+      </w:pPr>
+    </w:p>
+    <w:p>
+      <w:pPr>
+        <w:pStyle w:val="BodyText"/>
+      </w:pPr>
+    </w:p>
+    <w:p>
+      <w:pPr>
+        <w:pStyle w:val="BodyText"/>
+      </w:pPr>
+    </w:p>
+    <w:p>
+      <w:pPr>
+        <w:pStyle w:val="BodyText"/>
+        <w:spacing w:before="261"/>
+      </w:pPr>
+    </w:p>
+    <w:p>
+      <w:pPr>
+        <w:tabs>
+          <w:tab w:val="left" w:pos="7455"/>
+          <w:tab w:val="left" w:pos="7502"/>
+        </w:tabs>
+        <w:spacing w:before="1" w:line="540" w:lineRule="atLeast"/>
+        <w:ind w:left="6905" w:right="1424" w:hanging="74"/>
         <w:rPr>
           <w:sz w:val="18"/>
         </w:rPr>
@@ -914,20 +852,12 @@
       <w:r>
         <w:rPr>
           <w:noProof/>
-          <w:sz w:val="18"/>
+          <w:position w:val="-5"/>
         </w:rPr>
         <w:drawing>
-          <wp:anchor distT="0" distB="0" distL="0" distR="0" simplePos="0" relativeHeight="15730176" behindDoc="0" locked="0" layoutInCell="1" allowOverlap="1" wp14:anchorId="2031B2E7" wp14:editId="2DA91399">
-            <wp:simplePos x="0" y="0"/>
-            <wp:positionH relativeFrom="page">
-              <wp:posOffset>4607355</wp:posOffset>
-            </wp:positionH>
-            <wp:positionV relativeFrom="paragraph">
-              <wp:posOffset>20837</wp:posOffset>
-            </wp:positionV>
-            <wp:extent cx="206502" cy="142928"/>
+          <wp:inline distT="0" distB="0" distL="0" distR="0" wp14:anchorId="289DAF64" wp14:editId="445E620D">
+            <wp:extent cx="205727" cy="142239"/>
             <wp:effectExtent l="0" t="0" r="0" b="0"/>
-            <wp:wrapNone/>
             <wp:docPr id="7" name="Image 7"/>
             <wp:cNvGraphicFramePr>
               <a:graphicFrameLocks xmlns:a="http://schemas.openxmlformats.org/drawingml/2006/main"/>
@@ -948,7 +878,7 @@
                   <pic:spPr>
                     <a:xfrm>
                       <a:off x="0" y="0"/>
-                      <a:ext cx="206502" cy="142928"/>
+                      <a:ext cx="205727" cy="142239"/>
                     </a:xfrm>
                     <a:prstGeom prst="rect">
                       <a:avLst/>
@@ -957,46 +887,45 @@
                 </pic:pic>
               </a:graphicData>
             </a:graphic>
-          </wp:anchor>
+          </wp:inline>
         </w:drawing>
+      </w:r>
+      <w:r>
+        <w:rPr>
+          <w:rFonts w:ascii="Times New Roman"/>
+          <w:sz w:val="20"/>
+        </w:rPr>
+        <w:tab/>
       </w:r>
       <w:hyperlink r:id="rId7">
         <w:r>
           <w:rPr>
-            <w:color w:val="2B2D2D"/>
+            <w:color w:val="2A2C2C"/>
             <w:spacing w:val="-2"/>
-            <w:w w:val="110"/>
             <w:sz w:val="18"/>
           </w:rPr>
           <w:t>info@vibrantwebtech.in</w:t>
         </w:r>
       </w:hyperlink>
-    </w:p>
-    <w:p>
-      <w:pPr>
-        <w:spacing w:before="234"/>
-        <w:ind w:left="7501"/>
-        <w:rPr>
-          <w:sz w:val="18"/>
-        </w:rPr>
-      </w:pPr>
+      <w:r>
+        <w:rPr>
+          <w:color w:val="2A2C2C"/>
+          <w:spacing w:val="40"/>
+          <w:sz w:val="18"/>
+        </w:rPr>
+        <w:t xml:space="preserve">  </w:t>
+      </w:r>
       <w:r>
         <w:rPr>
           <w:noProof/>
+          <w:color w:val="2A2C2C"/>
+          <w:position w:val="-12"/>
           <w:sz w:val="18"/>
         </w:rPr>
         <w:drawing>
-          <wp:anchor distT="0" distB="0" distL="0" distR="0" simplePos="0" relativeHeight="15730688" behindDoc="0" locked="0" layoutInCell="1" allowOverlap="1" wp14:anchorId="4A619997" wp14:editId="1D4E1ADC">
-            <wp:simplePos x="0" y="0"/>
-            <wp:positionH relativeFrom="page">
-              <wp:posOffset>4654582</wp:posOffset>
-            </wp:positionH>
-            <wp:positionV relativeFrom="paragraph">
-              <wp:posOffset>130798</wp:posOffset>
-            </wp:positionV>
-            <wp:extent cx="166116" cy="223483"/>
+          <wp:inline distT="0" distB="0" distL="0" distR="0" wp14:anchorId="73E45493" wp14:editId="198D9306">
+            <wp:extent cx="165100" cy="222885"/>
             <wp:effectExtent l="0" t="0" r="0" b="0"/>
-            <wp:wrapNone/>
             <wp:docPr id="8" name="Image 8"/>
             <wp:cNvGraphicFramePr>
               <a:graphicFrameLocks xmlns:a="http://schemas.openxmlformats.org/drawingml/2006/main"/>
@@ -1017,7 +946,7 @@
                   <pic:spPr>
                     <a:xfrm>
                       <a:off x="0" y="0"/>
-                      <a:ext cx="166116" cy="223483"/>
+                      <a:ext cx="165100" cy="222885"/>
                     </a:xfrm>
                     <a:prstGeom prst="rect">
                       <a:avLst/>
@@ -1026,30 +955,45 @@
                 </pic:pic>
               </a:graphicData>
             </a:graphic>
-          </wp:anchor>
+          </wp:inline>
         </w:drawing>
       </w:r>
       <w:r>
         <w:rPr>
-          <w:color w:val="2B2D2D"/>
-          <w:w w:val="75"/>
+          <w:rFonts w:ascii="Times New Roman"/>
+          <w:color w:val="2A2C2C"/>
+          <w:sz w:val="18"/>
+        </w:rPr>
+        <w:tab/>
+      </w:r>
+      <w:r>
+        <w:rPr>
+          <w:rFonts w:ascii="Times New Roman"/>
+          <w:color w:val="2A2C2C"/>
+          <w:sz w:val="18"/>
+        </w:rPr>
+        <w:tab/>
+      </w:r>
+      <w:r>
+        <w:rPr>
+          <w:color w:val="2A2C2C"/>
+          <w:spacing w:val="-4"/>
           <w:sz w:val="18"/>
         </w:rPr>
         <w:t>+91</w:t>
       </w:r>
       <w:r>
         <w:rPr>
-          <w:color w:val="2B2D2D"/>
-          <w:spacing w:val="-5"/>
+          <w:color w:val="2A2C2C"/>
+          <w:spacing w:val="-11"/>
           <w:sz w:val="18"/>
         </w:rPr>
         <w:t xml:space="preserve"> </w:t>
       </w:r>
       <w:r>
         <w:rPr>
-          <w:color w:val="2B2D2D"/>
-          <w:spacing w:val="-2"/>
-          <w:w w:val="85"/>
+          <w:color w:val="2A2C2C"/>
+          <w:spacing w:val="-4"/>
           <w:sz w:val="18"/>
         </w:rPr>
         <w:t>8511110213</w:t>
@@ -1057,8 +1001,8 @@
     </w:p>
     <w:p>
       <w:pPr>
-        <w:spacing w:before="177" w:line="261" w:lineRule="auto"/>
-        <w:ind w:left="7454" w:right="200" w:firstLine="44"/>
+        <w:spacing w:before="116" w:line="295" w:lineRule="auto"/>
+        <w:ind w:left="7456" w:right="11" w:firstLine="44"/>
         <w:rPr>
           <w:sz w:val="18"/>
         </w:rPr>
@@ -1069,15 +1013,15 @@
           <w:sz w:val="18"/>
         </w:rPr>
         <w:drawing>
-          <wp:anchor distT="0" distB="0" distL="0" distR="0" simplePos="0" relativeHeight="15731200" behindDoc="0" locked="0" layoutInCell="1" allowOverlap="1" wp14:anchorId="58693E11" wp14:editId="587EEB57">
+          <wp:anchor distT="0" distB="0" distL="0" distR="0" simplePos="0" relativeHeight="15730688" behindDoc="0" locked="0" layoutInCell="1" allowOverlap="1" wp14:anchorId="674E1E53" wp14:editId="3AEE4B7E">
             <wp:simplePos x="0" y="0"/>
             <wp:positionH relativeFrom="page">
-              <wp:posOffset>4614140</wp:posOffset>
+              <wp:posOffset>4613909</wp:posOffset>
             </wp:positionH>
             <wp:positionV relativeFrom="paragraph">
-              <wp:posOffset>169381</wp:posOffset>
+              <wp:posOffset>123129</wp:posOffset>
             </wp:positionV>
-            <wp:extent cx="206672" cy="256317"/>
+            <wp:extent cx="205727" cy="255892"/>
             <wp:effectExtent l="0" t="0" r="0" b="0"/>
             <wp:wrapNone/>
             <wp:docPr id="9" name="Image 9"/>
@@ -1100,7 +1044,7 @@
                   <pic:spPr>
                     <a:xfrm>
                       <a:off x="0" y="0"/>
-                      <a:ext cx="206672" cy="256317"/>
+                      <a:ext cx="205727" cy="255892"/>
                     </a:xfrm>
                     <a:prstGeom prst="rect">
                       <a:avLst/>
@@ -1114,93 +1058,93 @@
       </w:r>
       <w:r>
         <w:rPr>
-          <w:color w:val="2B2D2D"/>
-          <w:w w:val="105"/>
+          <w:color w:val="2A2C2C"/>
+          <w:w w:val="110"/>
           <w:sz w:val="18"/>
         </w:rPr>
         <w:t>801,</w:t>
       </w:r>
       <w:r>
         <w:rPr>
-          <w:color w:val="2B2D2D"/>
-          <w:spacing w:val="-16"/>
-          <w:w w:val="105"/>
+          <w:color w:val="2A2C2C"/>
+          <w:spacing w:val="-13"/>
+          <w:w w:val="110"/>
           <w:sz w:val="18"/>
         </w:rPr>
         <w:t xml:space="preserve"> </w:t>
       </w:r>
       <w:r>
         <w:rPr>
-          <w:color w:val="2B2D2D"/>
-          <w:w w:val="105"/>
+          <w:color w:val="2A2C2C"/>
+          <w:w w:val="110"/>
           <w:sz w:val="18"/>
         </w:rPr>
         <w:t>Silicon</w:t>
       </w:r>
       <w:r>
         <w:rPr>
-          <w:color w:val="2B2D2D"/>
-          <w:spacing w:val="-16"/>
-          <w:w w:val="105"/>
+          <w:color w:val="2A2C2C"/>
+          <w:spacing w:val="-13"/>
+          <w:w w:val="110"/>
           <w:sz w:val="18"/>
         </w:rPr>
         <w:t xml:space="preserve"> </w:t>
       </w:r>
       <w:r>
         <w:rPr>
-          <w:color w:val="2B2D2D"/>
-          <w:w w:val="105"/>
+          <w:color w:val="2A2C2C"/>
+          <w:w w:val="110"/>
           <w:sz w:val="18"/>
         </w:rPr>
         <w:t>Tower,</w:t>
       </w:r>
       <w:r>
         <w:rPr>
-          <w:color w:val="2B2D2D"/>
-          <w:spacing w:val="-16"/>
-          <w:w w:val="105"/>
+          <w:color w:val="2A2C2C"/>
+          <w:spacing w:val="-12"/>
+          <w:w w:val="110"/>
           <w:sz w:val="18"/>
         </w:rPr>
         <w:t xml:space="preserve"> </w:t>
       </w:r>
       <w:r>
         <w:rPr>
-          <w:color w:val="2B2D2D"/>
-          <w:w w:val="105"/>
+          <w:color w:val="2A2C2C"/>
+          <w:w w:val="110"/>
           <w:sz w:val="18"/>
         </w:rPr>
         <w:t>Law</w:t>
       </w:r>
       <w:r>
         <w:rPr>
-          <w:color w:val="2B2D2D"/>
-          <w:spacing w:val="-16"/>
-          <w:w w:val="105"/>
+          <w:color w:val="2A2C2C"/>
+          <w:spacing w:val="-13"/>
+          <w:w w:val="110"/>
           <w:sz w:val="18"/>
         </w:rPr>
         <w:t xml:space="preserve"> </w:t>
       </w:r>
       <w:r>
         <w:rPr>
-          <w:color w:val="2B2D2D"/>
-          <w:w w:val="105"/>
+          <w:color w:val="2A2C2C"/>
+          <w:w w:val="110"/>
           <w:sz w:val="18"/>
         </w:rPr>
         <w:t>Garden,</w:t>
       </w:r>
       <w:r>
         <w:rPr>
-          <w:color w:val="2B2D2D"/>
-          <w:spacing w:val="-16"/>
-          <w:w w:val="105"/>
+          <w:color w:val="2A2C2C"/>
+          <w:spacing w:val="-13"/>
+          <w:w w:val="110"/>
           <w:sz w:val="18"/>
         </w:rPr>
         <w:t xml:space="preserve"> </w:t>
       </w:r>
       <w:r>
         <w:rPr>
-          <w:color w:val="2B2D2D"/>
-          <w:w w:val="105"/>
+          <w:color w:val="2A2C2C"/>
+          <w:w w:val="110"/>
           <w:sz w:val="18"/>
         </w:rPr>
         <w:t xml:space="preserve">opp. Axis Bank, </w:t>
@@ -1208,8 +1152,8 @@
       <w:proofErr w:type="spellStart"/>
       <w:r>
         <w:rPr>
-          <w:color w:val="2B2D2D"/>
-          <w:w w:val="105"/>
+          <w:color w:val="2A2C2C"/>
+          <w:w w:val="110"/>
           <w:sz w:val="18"/>
         </w:rPr>
         <w:t>Ellisbridge</w:t>
@@ -1217,25 +1161,25 @@
       <w:proofErr w:type="spellEnd"/>
       <w:r>
         <w:rPr>
-          <w:color w:val="2B2D2D"/>
-          <w:w w:val="105"/>
+          <w:color w:val="2A2C2C"/>
+          <w:w w:val="110"/>
           <w:sz w:val="18"/>
         </w:rPr>
         <w:t>, Ahmedabad, Gujarat</w:t>
       </w:r>
       <w:r>
         <w:rPr>
-          <w:color w:val="2B2D2D"/>
-          <w:spacing w:val="-13"/>
-          <w:w w:val="105"/>
+          <w:color w:val="2A2C2C"/>
+          <w:spacing w:val="-6"/>
+          <w:w w:val="110"/>
           <w:sz w:val="18"/>
         </w:rPr>
         <w:t xml:space="preserve"> </w:t>
       </w:r>
       <w:r>
         <w:rPr>
-          <w:color w:val="2B2D2D"/>
-          <w:w w:val="105"/>
+          <w:color w:val="2A2C2C"/>
+          <w:w w:val="110"/>
           <w:sz w:val="18"/>
         </w:rPr>
         <w:t>380006</w:t>
@@ -1243,8 +1187,8 @@
     </w:p>
     <w:sectPr>
       <w:type w:val="continuous"/>
-      <w:pgSz w:w="11910" w:h="16850"/>
-      <w:pgMar w:top="960" w:right="425" w:bottom="0" w:left="425" w:header="720" w:footer="720" w:gutter="0"/>
+      <w:pgSz w:w="11910" w:h="16840"/>
+      <w:pgMar w:top="940" w:right="425" w:bottom="0" w:left="425" w:header="720" w:footer="720" w:gutter="0"/>
       <w:cols w:space="720"/>
     </w:sectPr>
   </w:body>
@@ -1652,25 +1596,7 @@
     <w:name w:val="Normal"/>
     <w:qFormat/>
     <w:rPr>
-      <w:rFonts w:ascii="Lucida Sans Unicode" w:eastAsia="Lucida Sans Unicode" w:hAnsi="Lucida Sans Unicode" w:cs="Lucida Sans Unicode"/>
-    </w:rPr>
-  </w:style>
-  <w:style w:type="paragraph" w:styleId="Heading1">
-    <w:name w:val="heading 1"/>
-    <w:basedOn w:val="Normal"/>
-    <w:link w:val="Heading1Char"/>
-    <w:uiPriority w:val="9"/>
-    <w:qFormat/>
-    <w:pPr>
-      <w:ind w:left="11"/>
-      <w:outlineLvl w:val="0"/>
-    </w:pPr>
-    <w:rPr>
-      <w:rFonts w:ascii="Arial Black" w:eastAsia="Arial Black" w:hAnsi="Arial Black" w:cs="Arial Black"/>
-      <w:b/>
-      <w:bCs/>
-      <w:sz w:val="24"/>
-      <w:szCs w:val="24"/>
+      <w:rFonts w:ascii="Tahoma" w:eastAsia="Tahoma" w:hAnsi="Tahoma" w:cs="Tahoma"/>
     </w:rPr>
   </w:style>
   <w:style w:type="character" w:default="1" w:styleId="DefaultParagraphFont">
@@ -1721,20 +1647,6 @@
     <w:basedOn w:val="Normal"/>
     <w:uiPriority w:val="1"/>
     <w:qFormat/>
-  </w:style>
-  <w:style w:type="character" w:customStyle="1" w:styleId="Heading1Char">
-    <w:name w:val="Heading 1 Char"/>
-    <w:basedOn w:val="DefaultParagraphFont"/>
-    <w:link w:val="Heading1"/>
-    <w:uiPriority w:val="9"/>
-    <w:rsid w:val="00453AC7"/>
-    <w:rPr>
-      <w:rFonts w:ascii="Arial Black" w:eastAsia="Arial Black" w:hAnsi="Arial Black" w:cs="Arial Black"/>
-      <w:b/>
-      <w:bCs/>
-      <w:sz w:val="24"/>
-      <w:szCs w:val="24"/>
-    </w:rPr>
   </w:style>
 </w:styles>
 </file>

</xml_diff>

<commit_message>
feat: update enrollment number handling and enhance offer letter generation output
</commit_message>
<xml_diff>
--- a/offer_letter_app/output/temp/document.docx
+++ b/offer_letter_app/output/temp/document.docx
@@ -414,14 +414,15 @@
           <w:bCs/>
           <w:w w:val="90"/>
         </w:rPr>
-        <w:t>Issued</w:t>
+        <w:t>Issued on: 19/06/2026</w:t>
+        <w:tab/>
+        <w:t xml:space="preserve">                     Enrollment on: 230020</w:t>
       </w:r>
       <w:r>
         <w:rPr>
           <w:b/>
           <w:bCs/>
         </w:rPr>
-        <w:t xml:space="preserve"> </w:t>
       </w:r>
       <w:r>
         <w:rPr>
@@ -429,40 +430,31 @@
           <w:bCs/>
           <w:w w:val="90"/>
         </w:rPr>
-        <w:t>on</w:t>
       </w:r>
       <w:r>
         <w:rPr>
           <w:w w:val="90"/>
         </w:rPr>
-        <w:t>:</w:t>
       </w:r>
       <w:r>
         <w:rPr>
           <w:spacing w:val="1"/>
         </w:rPr>
-        <w:t xml:space="preserve"> </w:t>
       </w:r>
       <w:r>
         <w:rPr>
           <w:spacing w:val="-2"/>
           <w:w w:val="90"/>
         </w:rPr>
-        <w:t>19/06/2026</w:t>
-      </w:r>
-      <w:r>
-        <w:tab/>
-      </w:r>
-      <w:r>
-        <w:t xml:space="preserve">                     </w:t>
-      </w:r>
+      </w:r>
+      <w:r/>
+      <w:r/>
       <w:r>
         <w:rPr>
           <w:b/>
           <w:bCs/>
           <w:w w:val="95"/>
         </w:rPr>
-        <w:t>E</w:t>
       </w:r>
       <w:r>
         <w:rPr>
@@ -470,7 +462,6 @@
           <w:bCs/>
           <w:w w:val="95"/>
         </w:rPr>
-        <w:t>nrollment</w:t>
       </w:r>
       <w:r>
         <w:rPr>
@@ -479,7 +470,6 @@
           <w:spacing w:val="-14"/>
           <w:w w:val="95"/>
         </w:rPr>
-        <w:t xml:space="preserve"> </w:t>
       </w:r>
       <w:r>
         <w:rPr>
@@ -487,21 +477,18 @@
           <w:bCs/>
           <w:w w:val="95"/>
         </w:rPr>
-        <w:t>on:</w:t>
       </w:r>
       <w:r>
         <w:rPr>
           <w:spacing w:val="-14"/>
           <w:w w:val="95"/>
         </w:rPr>
-        <w:t xml:space="preserve"> </w:t>
       </w:r>
       <w:r>
         <w:rPr>
           <w:spacing w:val="-2"/>
           <w:w w:val="95"/>
         </w:rPr>
-        <w:t>2402106051</w:t>
       </w:r>
     </w:p>
     <w:p>

</xml_diff>

<commit_message>
feat: initialize offer history JSON and temporary document output directory
</commit_message>
<xml_diff>
--- a/offer_letter_app/output/temp/document.docx
+++ b/offer_letter_app/output/temp/document.docx
@@ -594,7 +594,7 @@
           <w:w w:val="110"/>
           <w:sz w:val="24"/>
         </w:rPr>
-        <w:t>President Institute Of Computer Application. Shayona Study Campus, Shayona City,</w:t>
+        <w:t>Asia Pacific Institute of Management Ashram Road, 9, Vidya Vihar Colony Rd, opp. Fortune Landmark Hotel Usmanpura, Ahmedabad, Gujarat 380009</w:t>
       </w:r>
       <w:proofErr w:type="gramStart"/>
       <w:r>
@@ -686,7 +686,6 @@
         <w:rPr>
           <w:sz w:val="24"/>
         </w:rPr>
-        <w:t>Ghatlodiya, Ahmedabad -380061</w:t>
       </w:r>
       <w:proofErr w:type="spellEnd"/>
       <w:r>
@@ -749,7 +748,7 @@
           <w:b w:val="0"/>
           <w:w w:val="90"/>
         </w:rPr>
-        <w:t>Date: 02/07/2026</w:t>
+        <w:t>Date: 07/07/2026</w:t>
       </w:r>
       <w:r>
         <w:rPr>
@@ -2368,7 +2367,7 @@
         <w:rPr>
           <w:b/>
         </w:rPr>
-        <w:t>Travels with Strangers</w:t>
+        <w:t>Ai study planner</w:t>
       </w:r>
       <w:r>
         <w:t xml:space="preserve"> Project using </w:t>
@@ -2377,7 +2376,7 @@
         <w:rPr>
           <w:b/>
         </w:rPr>
-        <w:t>Php</w:t>
+        <w:t>Python with AI ML</w:t>
       </w:r>
       <w:r>
         <w:t>. During the training period, they will receive practical guidance from our mentors and work on assignments and project development activities. They will spend 14 hours per week, including learning, assignments, and project work, to gain hands-on experience and enhance their technical skills.</w:t>
@@ -2751,7 +2750,7 @@
                               <w:rPr>
                                 <w:sz w:val="24"/>
                               </w:rPr>
-                              <w:t>Varsani Jenish</w:t>
+                              <w:t>Parita Harshadbhai Thummar</w:t>
                             </w:r>
                           </w:p>
                           <w:p>
@@ -2772,6 +2771,12 @@
                                 <w:sz w:val="20"/>
                               </w:rPr>
                             </w:pPr>
+                            <w:r>
+                              <w:rPr>
+                                <w:sz w:val="24"/>
+                              </w:rPr>
+                              <w:t>Purva Nimeshkumar Parikh</w:t>
+                            </w:r>
                           </w:p>
                           <w:p>
                             <w:pPr>
@@ -2792,6 +2797,12 @@
                                 <w:sz w:val="20"/>
                               </w:rPr>
                             </w:pPr>
+                            <w:r>
+                              <w:rPr>
+                                <w:sz w:val="24"/>
+                              </w:rPr>
+                              <w:t>Nandani Shaileshbhai  Parmar</w:t>
+                            </w:r>
                           </w:p>
                         </w:txbxContent>
                       </wps:txbx>
@@ -2850,7 +2861,7 @@
                         <w:rPr>
                           <w:sz w:val="24"/>
                         </w:rPr>
-                        <w:t>Varsani Jenish</w:t>
+                        <w:t>Parita Harshadbhai Thummar</w:t>
                       </w:r>
                     </w:p>
                     <w:p>
@@ -2871,6 +2882,12 @@
                           <w:sz w:val="20"/>
                         </w:rPr>
                       </w:pPr>
+                      <w:r>
+                        <w:rPr>
+                          <w:sz w:val="24"/>
+                        </w:rPr>
+                        <w:t>Purva Nimeshkumar Parikh</w:t>
+                      </w:r>
                     </w:p>
                     <w:p>
                       <w:pPr>
@@ -2891,6 +2908,12 @@
                           <w:sz w:val="20"/>
                         </w:rPr>
                       </w:pPr>
+                      <w:r>
+                        <w:rPr>
+                          <w:sz w:val="24"/>
+                        </w:rPr>
+                        <w:t>Nandani Shaileshbhai  Parmar</w:t>
+                      </w:r>
                     </w:p>
                   </w:txbxContent>
                 </v:textbox>
@@ -2990,7 +3013,7 @@
                                 <w:spacing w:val="-2"/>
                                 <w:sz w:val="24"/>
                               </w:rPr>
-                              <w:t>202312101801</w:t>
+                              <w:t>202435802160</w:t>
                             </w:r>
                           </w:p>
                           <w:p>
@@ -3014,6 +3037,7 @@
                                 <w:spacing w:val="-2"/>
                                 <w:sz w:val="24"/>
                               </w:rPr>
+                              <w:t>202435802064</w:t>
                             </w:r>
                           </w:p>
                           <w:p>
@@ -3037,6 +3061,7 @@
                                 <w:spacing w:val="-2"/>
                                 <w:sz w:val="24"/>
                               </w:rPr>
+                              <w:t>202435802070</w:t>
                             </w:r>
                           </w:p>
                         </w:txbxContent>
@@ -3105,7 +3130,7 @@
                           <w:spacing w:val="-2"/>
                           <w:sz w:val="24"/>
                         </w:rPr>
-                        <w:t>202312101801</w:t>
+                        <w:t>202435802160</w:t>
                       </w:r>
                     </w:p>
                     <w:p>
@@ -3129,6 +3154,7 @@
                           <w:spacing w:val="-2"/>
                           <w:sz w:val="24"/>
                         </w:rPr>
+                        <w:t>202435802064</w:t>
                       </w:r>
                     </w:p>
                     <w:p>
@@ -3152,6 +3178,7 @@
                           <w:spacing w:val="-2"/>
                           <w:sz w:val="24"/>
                         </w:rPr>
+                        <w:t>202435802070</w:t>
                       </w:r>
                     </w:p>
                   </w:txbxContent>

</xml_diff>